<commit_message>
build(config): one root .env, least-privilege env per container
- .env.example: comments on their own lines (compose read `KEY=  # note` as the value),
  POSTGRES_* replaces duplicated DATABASE_URL, not-yet-used vars commented by sprint
- docker-compose: api and bot get only the variables they need instead of the whole .env
  (bot no longer sees DB password / LLM keys); postgres credentials shared via YAML anchors
- Dockerfile: worker count from WEB_CONCURRENCY (API_WORKERS in .env) instead of hardcoded 2
- root .dockerignore: caddy build context 117 KB, no .env/node_modules/.venv sent to Docker;
  bot/web dockerignore exclude .env
- CI: POSTGRES_HOST instead of DATABASE_URL
- README "Cấu hình": where config lives, who reads what, 4-step rule for new variables

Co-Authored-By: Claude Opus 5.5 <noreply@anthropic.com>
</commit_message>
<xml_diff>
--- a/docs/export/04_ARCHITECTURE.docx
+++ b/docs/export/04_ARCHITECTURE.docx
@@ -3081,6 +3081,38 @@
                 <w:sz w:val="19"/>
               </w:rPr>
               <w:t>.env.example</w:t>
+            </w:r>
+            <w:r>
+              <w:rPr>
+                <w:sz w:val="19"/>
+              </w:rPr>
+              <w:t xml:space="preserve"> + </w:t>
+            </w:r>
+            <w:r>
+              <w:rPr>
+                <w:rFonts w:ascii="Consolas" w:hAnsi="Consolas"/>
+                <w:sz w:val="19"/>
+              </w:rPr>
+              <w:t>environment:</w:t>
+            </w:r>
+            <w:r>
+              <w:rPr>
+                <w:sz w:val="19"/>
+              </w:rPr>
+              <w:t xml:space="preserve"> của service cần nó trong </w:t>
+            </w:r>
+            <w:r>
+              <w:rPr>
+                <w:rFonts w:ascii="Consolas" w:hAnsi="Consolas"/>
+                <w:sz w:val="19"/>
+              </w:rPr>
+              <w:t>docker-compose.yml</w:t>
+            </w:r>
+            <w:r>
+              <w:rPr>
+                <w:sz w:val="19"/>
+              </w:rPr>
+              <w:t xml:space="preserve"> (README → Cấu hình)</w:t>
             </w:r>
           </w:p>
         </w:tc>

</xml_diff>